<commit_message>
Set mini-case write-ups due the previous day at 11:59 PM
</commit_message>
<xml_diff>
--- a/hub/files/Case2.docx
+++ b/hub/files/Case2.docx
@@ -123,7 +123,7 @@
               <w:rPr>
                 <w:sz w:val="19"/>
               </w:rPr>
-              <w:t>Wed Sep 16, start of class (write-up, every student); Team 1 presents in class that day</w:t>
+              <w:t>Write-up: Tue Sep 15, 11:59 PM Pacific (every student); Team 1 presents Wed Sep 16 in class</w:t>
             </w:r>
           </w:p>
         </w:tc>
@@ -212,7 +212,7 @@
               <w:rPr>
                 <w:sz w:val="19"/>
               </w:rPr>
-              <w:t>, one per student; Team 1 also uploads slides before class</w:t>
+              <w:t>, one per student; Team 1 uploads slides to the separate 20-point Mini-Case Presentation team assignment before class</w:t>
             </w:r>
           </w:p>
         </w:tc>
@@ -595,7 +595,7 @@
         <w:t xml:space="preserve">☐  </w:t>
       </w:r>
       <w:r>
-        <w:t>Slides — Team 1 only, uploaded before class</w:t>
+        <w:t>Slides — Team 1 only, uploaded to the separate Mini-Case Presentation team assignment before class</w:t>
       </w:r>
     </w:p>
     <w:p>

</xml_diff>

<commit_message>
Deploy simternship build 2026-09-11
</commit_message>
<xml_diff>
--- a/hub/files/Case2.docx
+++ b/hub/files/Case2.docx
@@ -916,7 +916,7 @@
               <w:rPr>
                 <w:sz w:val="19"/>
               </w:rPr>
-              <w:t>A decision rule for typing RQs taught clearly enough to apply; time spent on the RQs the class is most likely to get wrong</w:t>
+              <w:t>A decision rule for typing RQs taught clearly enough to apply, including the Differences rewrite test ("Does X differ between [group A] and [group B]?" — groups of respondents, not answer options); time spent on the RQs the class is most likely to get wrong</w:t>
             </w:r>
           </w:p>
         </w:tc>
@@ -2609,6 +2609,20 @@
         <w:t>Appendix C — RQ types: the decision rule</w:t>
       </w:r>
     </w:p>
+    <w:p>
+      <w:r>
+        <w:t xml:space="preserve">*Short form of the </w:t>
+      </w:r>
+      <w:r>
+        <w:rPr>
+          <w:b/>
+        </w:rPr>
+        <w:t>Research Question Types</w:t>
+      </w:r>
+      <w:r>
+        <w:t xml:space="preserve"> handout on Canvas (full examples and traps there). Names follow Burns &amp; Veeck 10e Ch. 10–12.*</w:t>
+      </w:r>
+    </w:p>
     <w:tbl>
       <w:tblPr>
         <w:tblStyle w:val="TableGrid"/>
@@ -2719,7 +2733,7 @@
                 <w:b/>
                 <w:sz w:val="19"/>
               </w:rPr>
-              <w:t>Where it leads (Week 11+)</w:t>
+              <w:t>Where it leads</w:t>
             </w:r>
           </w:p>
         </w:tc>
@@ -2741,6 +2755,19 @@
                 <w:sz w:val="19"/>
               </w:rPr>
               <w:t>Descriptive</w:t>
+            </w:r>
+            <w:r>
+              <w:rPr>
+                <w:sz w:val="19"/>
+              </w:rPr>
+              <w:t xml:space="preserve"> — </w:t>
+            </w:r>
+            <w:r>
+              <w:rPr>
+                <w:i/>
+                <w:sz w:val="19"/>
+              </w:rPr>
+              <w:t>one variable</w:t>
             </w:r>
           </w:p>
         </w:tc>
@@ -2795,7 +2822,7 @@
               <w:rPr>
                 <w:sz w:val="19"/>
               </w:rPr>
-              <w:t>The variable measured</w:t>
+              <w:t>The one variable measured</w:t>
             </w:r>
           </w:p>
         </w:tc>
@@ -2813,7 +2840,7 @@
               <w:rPr>
                 <w:sz w:val="19"/>
               </w:rPr>
-              <w:t>Ch. 10 — percentages, means, confidence intervals</w:t>
+              <w:t>Percentages, means, confidence intervals (Ch. 10, Week 8)</w:t>
             </w:r>
           </w:p>
         </w:tc>
@@ -2835,6 +2862,19 @@
                 <w:sz w:val="19"/>
               </w:rPr>
               <w:t>Differences</w:t>
+            </w:r>
+            <w:r>
+              <w:rPr>
+                <w:sz w:val="19"/>
+              </w:rPr>
+              <w:t xml:space="preserve"> — </w:t>
+            </w:r>
+            <w:r>
+              <w:rPr>
+                <w:i/>
+                <w:sz w:val="19"/>
+              </w:rPr>
+              <w:t>groups compared</w:t>
             </w:r>
           </w:p>
         </w:tc>
@@ -2933,7 +2973,7 @@
               <w:rPr>
                 <w:sz w:val="19"/>
               </w:rPr>
-              <w:t>Ch. 11 — t-test, ANOVA, chi-square</w:t>
+              <w:t>t-test / ANOVA if the analysis variable is measured (Ch. 11, Week 9); cross-tab + chi-square if it is categorical (Ch. 12, Week 11)</w:t>
             </w:r>
           </w:p>
         </w:tc>
@@ -2956,6 +2996,19 @@
               </w:rPr>
               <w:t>Association</w:t>
             </w:r>
+            <w:r>
+              <w:rPr>
+                <w:sz w:val="19"/>
+              </w:rPr>
+              <w:t xml:space="preserve"> — </w:t>
+            </w:r>
+            <w:r>
+              <w:rPr>
+                <w:i/>
+                <w:sz w:val="19"/>
+              </w:rPr>
+              <w:t>two measures co-vary</w:t>
+            </w:r>
           </w:p>
         </w:tc>
         <w:tc>
@@ -2973,7 +3026,7 @@
                 <w:i/>
                 <w:sz w:val="19"/>
               </w:rPr>
-              <w:t>Do two measured things move together?</w:t>
+              <w:t>Do two measured quantities move together?</w:t>
             </w:r>
           </w:p>
         </w:tc>
@@ -2991,7 +3044,7 @@
               <w:rPr>
                 <w:sz w:val="19"/>
               </w:rPr>
-              <w:t>Two variables, each measured on every respondent (income and purchase frequency; age and frequency): as one rises, does the other rise or fall?</w:t>
+              <w:t>Two variables, each a measured quantity on every respondent (income and purchase frequency; age and frequency): as one rises, does the other rise or fall? Both interval-level; 5+-point rating scales count</w:t>
             </w:r>
           </w:p>
         </w:tc>
@@ -3009,7 +3062,7 @@
               <w:rPr>
                 <w:sz w:val="19"/>
               </w:rPr>
-              <w:t>The two variables associated</w:t>
+              <w:t>The two measured variables</w:t>
             </w:r>
           </w:p>
         </w:tc>
@@ -3027,7 +3080,7 @@
               <w:rPr>
                 <w:sz w:val="19"/>
               </w:rPr>
-              <w:t>Ch. 12 — correlation, regression</w:t>
+              <w:t>Pearson correlation (Ch. 12; correlation video with the exam-review package)</w:t>
             </w:r>
           </w:p>
         </w:tc>
@@ -3060,7 +3113,7 @@
         <w:t>Differences</w:t>
       </w:r>
       <w:r>
-        <w:t xml:space="preserve"> RQ. If it is a measured quantity on every respondent (continuous or ordinal), it is an </w:t>
+        <w:t xml:space="preserve"> RQ. If both variables are measured quantities on every respondent, it is an </w:t>
       </w:r>
       <w:r>
         <w:rPr>
@@ -3070,6 +3123,35 @@
       </w:r>
       <w:r>
         <w:t xml:space="preserve"> RQ. "Do men or women…" → groups → Differences. "Is income associated with…" → two measured quantities → Association.</w:t>
+      </w:r>
+    </w:p>
+    <w:p>
+      <w:r>
+        <w:rPr>
+          <w:b/>
+        </w:rPr>
+        <w:t>The rewrite test for Differences:</w:t>
+      </w:r>
+      <w:r>
+        <w:t xml:space="preserve"> every Differences RQ can be rephrased *"Does [analysis variable] differ </w:t>
+      </w:r>
+      <w:r>
+        <w:rPr>
+          <w:b/>
+        </w:rPr>
+        <w:t>between [group A] and [group B]</w:t>
+      </w:r>
+      <w:r>
+        <w:t>?"</w:t>
+      </w:r>
+      <w:r>
+        <w:rPr>
+          <w:i/>
+        </w:rPr>
+        <w:t xml:space="preserve"> where A and B are kinds of </w:t>
+      </w:r>
+      <w:r>
+        <w:t>respondents*. If the rewrite will not work, it is not a Differences RQ.</w:t>
       </w:r>
     </w:p>
     <w:p>
@@ -3089,7 +3171,7 @@
         <w:t>or</w:t>
       </w:r>
       <w:r>
-        <w:t xml:space="preserve"> a florist?" has no grouping variable — nobody is split into groups and compared. It describes how one variable (outlet) is distributed across everyone: </w:t>
+        <w:t xml:space="preserve"> a florist?" has no grouping variable — nobody is split into groups and compared, and the rewrite test fails (supermarket and florist are answer options, not people). It describes how one variable (outlet) is distributed across everyone: </w:t>
       </w:r>
       <w:r>
         <w:rPr>
@@ -3099,6 +3181,35 @@
       </w:r>
       <w:r>
         <w:t>.</w:t>
+      </w:r>
+    </w:p>
+    <w:p>
+      <w:r>
+        <w:rPr>
+          <w:b/>
+        </w:rPr>
+        <w:t>A cross-tab is still Differences here.</w:t>
+      </w:r>
+      <w:r>
+        <w:t xml:space="preserve"> The textbook discusses cross-tabs and chi-square in Chapter 12 under "associations." In this course any RQ with a grouping variable is labeled </w:t>
+      </w:r>
+      <w:r>
+        <w:rPr>
+          <w:b/>
+        </w:rPr>
+        <w:t>Differences</w:t>
+      </w:r>
+      <w:r>
+        <w:t xml:space="preserve">, whichever test follows; </w:t>
+      </w:r>
+      <w:r>
+        <w:rPr>
+          <w:b/>
+        </w:rPr>
+        <w:t>Association</w:t>
+      </w:r>
+      <w:r>
+        <w:t xml:space="preserve"> is reserved for two measured quantities analyzed with Pearson correlation.</w:t>
       </w:r>
     </w:p>
     <w:p>

</xml_diff>

<commit_message>
Deploy simternship build 2026-10-05
</commit_message>
<xml_diff>
--- a/hub/files/Case2.docx
+++ b/hub/files/Case2.docx
@@ -1944,14 +1944,60 @@
         </w:sectPr>
       </w:pPr>
     </w:p>
-    <w:p>
-      <w:r>
-        <w:rPr>
-          <w:b/>
-        </w:rPr>
-        <w:t>Our decision rule for typing an RQ (1–2 sentences):</w:t>
-      </w:r>
-    </w:p>
+    <w:tbl>
+      <w:tblPr>
+        <w:tblStyle w:val="TableGrid"/>
+        <w:tblW w:type="auto" w:w="0"/>
+        <w:tblLook w:firstColumn="1" w:firstRow="1" w:lastColumn="0" w:lastRow="0" w:noHBand="0" w:noVBand="1" w:val="04A0"/>
+      </w:tblPr>
+      <w:tblGrid>
+        <w:gridCol w:w="9936"/>
+      </w:tblGrid>
+      <w:tr>
+        <w:tc>
+          <w:tcPr>
+            <w:tcW w:type="dxa" w:w="9936"/>
+          </w:tcPr>
+          <w:p>
+            <w:r>
+              <w:rPr>
+                <w:b/>
+                <w:sz w:val="19"/>
+              </w:rPr>
+            </w:r>
+            <w:r>
+              <w:rPr>
+                <w:b/>
+                <w:sz w:val="19"/>
+              </w:rPr>
+              <w:t>Our decision rule for typing an RQ (1–2 sentences)</w:t>
+            </w:r>
+          </w:p>
+        </w:tc>
+      </w:tr>
+      <w:tr>
+        <w:tc>
+          <w:tcPr>
+            <w:tcW w:type="dxa" w:w="9936"/>
+          </w:tcPr>
+          <w:p>
+            <w:r>
+              <w:rPr>
+                <w:sz w:val="19"/>
+              </w:rPr>
+            </w:r>
+            <w:r>
+              <w:rPr>
+                <w:i/>
+                <w:sz w:val="19"/>
+              </w:rPr>
+              <w:t>(type your answer here)</w:t>
+            </w:r>
+          </w:p>
+        </w:tc>
+      </w:tr>
+    </w:tbl>
+    <w:p/>
     <w:p>
       <w:pPr>
         <w:pStyle w:val="Heading3"/>
@@ -2503,14 +2549,60 @@
         </w:sectPr>
       </w:pPr>
     </w:p>
-    <w:p>
-      <w:r>
-        <w:rPr>
-          <w:b/>
-        </w:rPr>
-        <w:t>Our decision rule for typing an RQ (1–2 sentences):</w:t>
-      </w:r>
-    </w:p>
+    <w:tbl>
+      <w:tblPr>
+        <w:tblStyle w:val="TableGrid"/>
+        <w:tblW w:type="auto" w:w="0"/>
+        <w:tblLook w:firstColumn="1" w:firstRow="1" w:lastColumn="0" w:lastRow="0" w:noHBand="0" w:noVBand="1" w:val="04A0"/>
+      </w:tblPr>
+      <w:tblGrid>
+        <w:gridCol w:w="9936"/>
+      </w:tblGrid>
+      <w:tr>
+        <w:tc>
+          <w:tcPr>
+            <w:tcW w:type="dxa" w:w="9936"/>
+          </w:tcPr>
+          <w:p>
+            <w:r>
+              <w:rPr>
+                <w:b/>
+                <w:sz w:val="19"/>
+              </w:rPr>
+            </w:r>
+            <w:r>
+              <w:rPr>
+                <w:b/>
+                <w:sz w:val="19"/>
+              </w:rPr>
+              <w:t>Our decision rule for typing an RQ (1–2 sentences)</w:t>
+            </w:r>
+          </w:p>
+        </w:tc>
+      </w:tr>
+      <w:tr>
+        <w:tc>
+          <w:tcPr>
+            <w:tcW w:type="dxa" w:w="9936"/>
+          </w:tcPr>
+          <w:p>
+            <w:r>
+              <w:rPr>
+                <w:sz w:val="19"/>
+              </w:rPr>
+            </w:r>
+            <w:r>
+              <w:rPr>
+                <w:i/>
+                <w:sz w:val="19"/>
+              </w:rPr>
+              <w:t>(type your answer here)</w:t>
+            </w:r>
+          </w:p>
+        </w:tc>
+      </w:tr>
+    </w:tbl>
+    <w:p/>
     <w:p>
       <w:pPr>
         <w:pStyle w:val="Heading3"/>

</xml_diff>